<commit_message>
fix: figuras y pies centrados, tablas sin huecos de media pagina
- reference-fime, -formemp y -martinez: Image Caption, Captioned Figure
  y Figure centrados, con interlineado sencillo (como ya tenia integrador).
- Las imagenes se centran en todos los perfiles, no solo en integrador.
- -TablaCompacta se salta la tabla de integrantes de la portada, mantiene
  el parrafo de presentacion y el encabezado con la tabla y separa el
  parrafo siguiente; la tabla puede seguir en la pagina siguiente.

Co-Authored-By: Claude Opus 5.5 <noreply@anthropic.com>
</commit_message>
<xml_diff>
--- a/plantillas/reference-fime.docx
+++ b/plantillas/reference-fime.docx
@@ -1359,16 +1359,26 @@
   <w:style w:type="paragraph" w:customStyle="1" w:styleId="ImageCaption">
     <w:name w:val="Image Caption"/>
     <w:basedOn w:val="Descripcin"/>
+    <w:pPr>
+      <w:spacing w:before="60" w:after="240" w:line="240" w:lineRule="auto"/>
+      <w:jc w:val="center"/>
+    </w:pPr>
   </w:style>
   <w:style w:type="paragraph" w:customStyle="1" w:styleId="Figure">
     <w:name w:val="Figure"/>
     <w:basedOn w:val="Normal"/>
+    <w:pPr>
+      <w:spacing w:before="120" w:after="120" w:line="240" w:lineRule="auto"/>
+      <w:jc w:val="center"/>
+    </w:pPr>
   </w:style>
   <w:style w:type="paragraph" w:customStyle="1" w:styleId="CaptionedFigure">
     <w:name w:val="Captioned Figure"/>
     <w:basedOn w:val="Figure"/>
     <w:pPr>
       <w:keepNext/>
+      <w:spacing w:before="120" w:after="40" w:line="240" w:lineRule="auto"/>
+      <w:jc w:val="center"/>
     </w:pPr>
   </w:style>
   <w:style w:type="character" w:customStyle="1" w:styleId="DescripcinCar">

</xml_diff>